<commit_message>
ARTi-demo: varied figures, explicit Zotero template, work in cwd; arti-docx: Arial, three-line/landscape tables, annotation strip, preview.py
</commit_message>
<xml_diff>
--- a/tools/arti-docx/assets/default-academic-template-zotero.docx
+++ b/tools/arti-docx/assets/default-academic-template-zotero.docx
@@ -10757,7 +10757,7 @@
   <w:docDefaults>
     <w:rPrDefault>
       <w:rPr>
-        <w:rFonts w:ascii="Calibri" w:eastAsia="Calibri" w:hAnsi="Calibri" w:cs="Calibri"/>
+        <w:rFonts w:ascii="Arial" w:eastAsia="Arial" w:hAnsi="Arial" w:cs="Arial"/>
         <w:sz w:val="24"/>
         <w:szCs w:val="24"/>
         <w:lang w:val="en-US" w:eastAsia="en-ID" w:bidi="ar-SA"/>
@@ -11598,7 +11598,7 @@
     </a:clrScheme>
     <a:fontScheme name="Office">
       <a:majorFont>
-        <a:latin typeface="Calibri Light" panose="020F0302020204030204"/>
+        <a:latin typeface="Arial" panose="020F0302020204030204"/>
         <a:ea typeface=""/>
         <a:cs typeface=""/>
         <a:font script="Jpan" typeface="游ゴシック Light"/>
@@ -11650,7 +11650,7 @@
         <a:font script="Tfng" typeface="Ebrima"/>
       </a:majorFont>
       <a:minorFont>
-        <a:latin typeface="Calibri" panose="020F0502020204030204"/>
+        <a:latin typeface="Arial" panose="020F0502020204030204"/>
         <a:ea typeface=""/>
         <a:cs typeface=""/>
         <a:font script="Jpan" typeface="游明朝"/>

</xml_diff>